<commit_message>
docs: điền thông tin 5 thành viên nhóm vào các tài liệu
Cập nhật Họ và tên, MSSV, Email vào README.md, đề cương chi tiết,
đề xuất 1 trang, và bảng Roles and Responsibilities trong SDP.
Vai trò giữ theo thứ tự đã định sẵn (Pose Estimation/Mini-game/Backend/
Giao diện/Kiểm thử), Võ Hoàng Phúc thêm vai trò Trưởng nhóm.
Vision Document không cần sửa vì mục Stakeholder mô tả theo nhóm
vai trò, đúng chuẩn RUP, không liệt kê tên cá nhân.
</commit_message>
<xml_diff>
--- a/docs/PA02_SDP_FitDuel.docx
+++ b/docs/PA02_SDP_FitDuel.docx
@@ -2642,7 +2642,7 @@
                 <w:sz w:val="20"/>
                 <w:szCs w:val="20"/>
               </w:rPr>
-              <w:t xml:space="preserve"/>
+              <w:t xml:space="preserve">Võ Hoàng Phúc</w:t>
             </w:r>
           </w:p>
         </w:tc>
@@ -2672,7 +2672,7 @@
                 <w:sz w:val="20"/>
                 <w:szCs w:val="20"/>
               </w:rPr>
-              <w:t xml:space="preserve"/>
+              <w:t xml:space="preserve">24120123</w:t>
             </w:r>
           </w:p>
         </w:tc>
@@ -2794,7 +2794,7 @@
                 <w:sz w:val="20"/>
                 <w:szCs w:val="20"/>
               </w:rPr>
-              <w:t xml:space="preserve"/>
+              <w:t xml:space="preserve">Nguyễn Đức Duy Tân</w:t>
             </w:r>
           </w:p>
         </w:tc>
@@ -2824,7 +2824,7 @@
                 <w:sz w:val="20"/>
                 <w:szCs w:val="20"/>
               </w:rPr>
-              <w:t xml:space="preserve"/>
+              <w:t xml:space="preserve">24120135</w:t>
             </w:r>
           </w:p>
         </w:tc>
@@ -2946,7 +2946,7 @@
                 <w:sz w:val="20"/>
                 <w:szCs w:val="20"/>
               </w:rPr>
-              <w:t xml:space="preserve"/>
+              <w:t xml:space="preserve">Bùi Văn Thiên</w:t>
             </w:r>
           </w:p>
         </w:tc>
@@ -2976,7 +2976,7 @@
                 <w:sz w:val="20"/>
                 <w:szCs w:val="20"/>
               </w:rPr>
-              <w:t xml:space="preserve"/>
+              <w:t xml:space="preserve">24120138</w:t>
             </w:r>
           </w:p>
         </w:tc>
@@ -3098,7 +3098,7 @@
                 <w:sz w:val="20"/>
                 <w:szCs w:val="20"/>
               </w:rPr>
-              <w:t xml:space="preserve"/>
+              <w:t xml:space="preserve">Nguyễn Lê Anh Tuấn</w:t>
             </w:r>
           </w:p>
         </w:tc>
@@ -3128,7 +3128,7 @@
                 <w:sz w:val="20"/>
                 <w:szCs w:val="20"/>
               </w:rPr>
-              <w:t xml:space="preserve"/>
+              <w:t xml:space="preserve">24120153</w:t>
             </w:r>
           </w:p>
         </w:tc>
@@ -3250,7 +3250,7 @@
                 <w:sz w:val="20"/>
                 <w:szCs w:val="20"/>
               </w:rPr>
-              <w:t xml:space="preserve"/>
+              <w:t xml:space="preserve">Cáp Hữu Duy</w:t>
             </w:r>
           </w:p>
         </w:tc>
@@ -3280,7 +3280,7 @@
                 <w:sz w:val="20"/>
                 <w:szCs w:val="20"/>
               </w:rPr>
-              <w:t xml:space="preserve"/>
+              <w:t xml:space="preserve">24120177</w:t>
             </w:r>
           </w:p>
         </w:tc>

</xml_diff>

<commit_message>
style: loại bỏ các dấu hiệu văn phong AI trong 2 tài liệu PA02
Dấu gạch ngang (—) dùng làm từ nối gần như ở mọi câu được thay bằng
dấu chấm, phẩy hoặc ngoặc đơn tùy ngữ cảnh. Giữ nguyên dấu gạch ngang
trong các nhãn định danh ngắn lặp lại nhiều lần (bảng "Người X — Vai
trò", "R0-R3 — tên bản phát hành") vì đó là quy ước đặt tên, không
phải câu văn. Bỏ 1 câu rào đón chung chung chép từ hướng dẫn gốc của
template RUP, không mang thông tin riêng của FitDuel. Viết lại 1 câu
dùng cấu trúc "không chỉ X mà còn Y" thành câu phát biểu trực tiếp.
Không thay đổi số liệu, tên người, MSSV, hay bất kỳ nội dung kỹ thuật
nào — đã đối chiếu số từ trước/sau và số bảng trong cả 2 file.
</commit_message>
<xml_diff>
--- a/docs/PA02_SDP_FitDuel.docx
+++ b/docs/PA02_SDP_FitDuel.docx
@@ -425,7 +425,7 @@
         <w:spacing w:after="120" w:line="276"/>
       </w:pPr>
       <w:r>
-        <w:t xml:space="preserve">Tài liệu này là Kế hoạch phát triển phần mềm (Software Development Plan — SDP) của dự án FitDuel, được viết theo cấu trúc tài liệu SDP dạng rút gọn (Small Project) của quy trình RUP (Rational Unified Process). Nội dung tài liệu dựa trên các tài liệu đã có thật của dự án: Đề cương đồ án (docs/De_cuong_du_an_FitDuel.docx), sơ đồ Gantt chi tiết (docs/Gantt_FitDuel_chi_tiet.xlsx), quy ước đóng góp (CONTRIBUTING.md) và trạng thái mã nguồn thực tế trong thư mục app/.</w:t>
+        <w:t xml:space="preserve">Tài liệu này là Kế hoạch phát triển phần mềm (Software Development Plan, gọi tắt là SDP) của dự án FitDuel, được viết theo cấu trúc tài liệu SDP dạng rút gọn (Small Project) của quy trình RUP (Rational Unified Process). Nội dung tài liệu dựa trên các tài liệu đã có thật của dự án: Đề cương đồ án (docs/De_cuong_du_an_FitDuel.docx), sơ đồ Gantt chi tiết (docs/Gantt_FitDuel_chi_tiet.xlsx), quy ước đóng góp (CONTRIBUTING.md) và trạng thái mã nguồn thực tế trong thư mục app/.</w:t>
       </w:r>
     </w:p>
     <w:p>
@@ -462,7 +462,7 @@
         <w:spacing w:after="60" w:line="276"/>
       </w:pPr>
       <w:r>
-        <w:t xml:space="preserve">Các thành viên trong nhóm — dùng tài liệu này làm điểm tham chiếu chung để biết phần việc của mình, mốc thời gian phải hoàn thành, và quy trình phải tuân theo khi đóng góp mã nguồn.</w:t>
+        <w:t xml:space="preserve">Các thành viên trong nhóm: dùng tài liệu này làm điểm tham chiếu chung để biết phần việc của mình, mốc thời gian phải hoàn thành, và quy trình phải tuân theo khi đóng góp mã nguồn.</w:t>
       </w:r>
     </w:p>
     <w:p>
@@ -475,7 +475,7 @@
         <w:spacing w:after="60" w:line="276"/>
       </w:pPr>
       <w:r>
-        <w:t xml:space="preserve">Giảng viên hướng dẫn và người đánh giá đồ án — dùng tài liệu này để đối chiếu tiến độ thực tế với kế hoạch mà nhóm đã cam kết, và để thấy nhóm có áp dụng đúng quy trình công nghệ phần mềm hay không.</w:t>
+        <w:t xml:space="preserve">Giảng viên hướng dẫn và người đánh giá đồ án: dùng tài liệu này để đối chiếu tiến độ thực tế với kế hoạch mà nhóm đã cam kết, và để thấy nhóm có áp dụng đúng quy trình công nghệ phần mềm hay không.</w:t>
       </w:r>
     </w:p>
     <w:p>
@@ -512,7 +512,7 @@
         <w:spacing w:after="60" w:line="276"/>
       </w:pPr>
       <w:r>
-        <w:t xml:space="preserve">Mô tả bài toán, nhu cầu người dùng và các tính năng ở mức cao — xem Vision Document (tài liệu song hành cùng tài liệu này).</w:t>
+        <w:t xml:space="preserve">Mô tả bài toán, nhu cầu người dùng và các tính năng ở mức cao: xem Vision Document (tài liệu song hành cùng tài liệu này).</w:t>
       </w:r>
     </w:p>
     <w:p>
@@ -525,7 +525,7 @@
         <w:spacing w:after="60" w:line="276"/>
       </w:pPr>
       <w:r>
-        <w:t xml:space="preserve">Danh sách yêu cầu chức năng và phi chức năng chi tiết — xem Đề cương đồ án (SRS sơ bộ), mục 6 và mục 7.</w:t>
+        <w:t xml:space="preserve">Danh sách yêu cầu chức năng và phi chức năng chi tiết: xem Đề cương đồ án (SRS sơ bộ), mục 6 và mục 7.</w:t>
       </w:r>
     </w:p>
     <w:p>
@@ -538,7 +538,7 @@
         <w:spacing w:after="60" w:line="276"/>
       </w:pPr>
       <w:r>
-        <w:t xml:space="preserve">Thiết kế kỹ thuật chi tiết — xem các tài liệu đặc tả trong thư mục docs/: pose_estimation_spec.md (công thức đo độ sâu chuyển động), game_mechanics_spec.md (cơ chế mini-game), firebase_schema.md (schema dữ liệu đồng bộ).</w:t>
+        <w:t xml:space="preserve">Thiết kế kỹ thuật chi tiết: xem các tài liệu đặc tả trong thư mục docs/: pose_estimation_spec.md (công thức đo độ sâu chuyển động), game_mechanics_spec.md (cơ chế mini-game), firebase_schema.md (schema dữ liệu đồng bộ).</w:t>
       </w:r>
     </w:p>
     <w:p>
@@ -574,7 +574,7 @@
         <w:t xml:space="preserve">Project Overview</w:t>
       </w:r>
       <w:r>
-        <w:t xml:space="preserve"> — mục đích, phạm vi và mục tiêu của dự án; các giả định và ràng buộc mà kế hoạch dựa trên; danh sách sản phẩm bàn giao.</w:t>
+        <w:t xml:space="preserve">: mục đích, phạm vi và mục tiêu của dự án; các giả định và ràng buộc mà kế hoạch dựa trên; danh sách sản phẩm bàn giao.</w:t>
       </w:r>
     </w:p>
     <w:p>
@@ -594,7 +594,7 @@
         <w:t xml:space="preserve">Project Organization</w:t>
       </w:r>
       <w:r>
-        <w:t xml:space="preserve"> — cách nhóm tự tổ chức và bảng phân công 5 vai trò cùng trách nhiệm tương ứng.</w:t>
+        <w:t xml:space="preserve">: cách nhóm tự tổ chức và bảng phân công 5 vai trò cùng trách nhiệm tương ứng.</w:t>
       </w:r>
     </w:p>
     <w:p>
@@ -614,7 +614,7 @@
         <w:t xml:space="preserve">Management Process</w:t>
       </w:r>
       <w:r>
-        <w:t xml:space="preserve"> — ước lượng công sức, kế hoạch theo pha RUP, mục tiêu từng giai đoạn, các bản phát hành, lịch trình chi tiết theo tuần, nguồn lực; và các quy trình theo dõi, kiểm soát dự án (quản lý yêu cầu, báo cáo/đo lường, quản lý rủi ro, quản lý cấu hình).</w:t>
+        <w:t xml:space="preserve">: ước lượng công sức, kế hoạch theo pha RUP, mục tiêu từng giai đoạn, các bản phát hành, lịch trình chi tiết theo tuần, nguồn lực; và các quy trình theo dõi, kiểm soát dự án (quản lý yêu cầu, báo cáo/đo lường, quản lý rủi ro, quản lý cấu hình).</w:t>
       </w:r>
     </w:p>
     <w:p>
@@ -650,7 +650,7 @@
         <w:spacing w:after="120" w:line="276"/>
       </w:pPr>
       <w:r>
-        <w:t xml:space="preserve">Tập thể dục tại nhà một mình (hít đất, squat, plank) rất dễ bỏ cuộc giữa chừng vì thiếu động lực, không có ai theo dõi hay tập cùng. Các ứng dụng thể dục hiện tại phần lớn chỉ đếm số lần hoặc đếm thời gian, không tạo được cảm giác hồi hộp như đang thi đấu thật với người khác. FitDuel giải quyết vấn đề này bằng cách biến buổi tập thành một trận đấu trực tuyến 1-1: camera điện thoại nhận diện chuyển động cơ thể theo thời gian thực và biến nó thành cần điều khiển của một mini-game kiểu Flappy Bird — người chơi không chỉ thi ai làm được nhiều hoặc lâu hơn, mà còn phải tập đúng nhịp để không thua ngay trong game.</w:t>
+        <w:t xml:space="preserve">Tập thể dục tại nhà một mình (hít đất, squat, plank) rất dễ bỏ cuộc giữa chừng vì thiếu động lực, không có ai theo dõi hay tập cùng. Các ứng dụng thể dục hiện tại phần lớn chỉ đếm số lần hoặc đếm thời gian, không tạo được cảm giác hồi hộp như đang thi đấu thật với người khác. FitDuel giải quyết vấn đề này bằng cách biến buổi tập thành một trận đấu trực tuyến 1-1: camera điện thoại nhận diện chuyển động cơ thể theo thời gian thực và biến nó thành cần điều khiển của một mini-game kiểu Flappy Bird. Thắng thua phụ thuộc vào cả số lần hoặc thời gian tập, lẫn việc tập đúng nhịp để không thua ngay trong game.</w:t>
       </w:r>
     </w:p>
     <w:p>
@@ -701,7 +701,7 @@
         <w:spacing w:after="60" w:line="276"/>
       </w:pPr>
       <w:r>
-        <w:t xml:space="preserve">Đo được chuyển động cơ thể theo thời gian thực bằng pose estimation với độ trễ đủ thấp để chơi game mượt — mục tiêu trên 15 khung hình/giây.</w:t>
+        <w:t xml:space="preserve">Đo được chuyển động cơ thể theo thời gian thực bằng pose estimation với độ trễ đủ thấp để chơi game mượt, với mục tiêu trên 15 khung hình/giây.</w:t>
       </w:r>
     </w:p>
     <w:p>
@@ -752,7 +752,7 @@
         <w:spacing w:after="60" w:line="276"/>
       </w:pPr>
       <w:r>
-        <w:t xml:space="preserve">Thêm bài tập squat — dùng chung cơ chế ánh xạ lên-xuống như hít đất.</w:t>
+        <w:t xml:space="preserve">Thêm bài tập squat, dùng chung cơ chế ánh xạ lên-xuống như hít đất.</w:t>
       </w:r>
     </w:p>
     <w:p>
@@ -765,7 +765,7 @@
         <w:spacing w:after="60" w:line="276"/>
       </w:pPr>
       <w:r>
-        <w:t xml:space="preserve">Thêm bài tập plank — cần thiết kế mini-game khác dạng giữ thăng bằng, vì plank là tư thế tĩnh, không có chuyển động lên-xuống theo chu kỳ nên không ánh xạ tự nhiên vào cơ chế game hiện tại.</w:t>
+        <w:t xml:space="preserve">Thêm bài tập plank, cần thiết kế mini-game khác dạng giữ thăng bằng, vì plank là tư thế tĩnh, không có chuyển động lên-xuống theo chu kỳ nên không ánh xạ tự nhiên vào cơ chế game hiện tại.</w:t>
       </w:r>
     </w:p>
     <w:p>
@@ -842,7 +842,7 @@
         <w:spacing w:after="60" w:line="276"/>
       </w:pPr>
       <w:r>
-        <w:t xml:space="preserve">Độ chính xác đo chuyển động phụ thuộc ánh sáng và vị trí đặt điện thoại — cần hướng dẫn người dùng đặt máy cách xa khoảng 1–1,5 m và thấy toàn thân trước khi vào trận.</w:t>
+        <w:t xml:space="preserve">Độ chính xác đo chuyển động phụ thuộc ánh sáng và vị trí đặt điện thoại, nên cần hướng dẫn người dùng đặt máy cách xa khoảng 1–1,5 m và thấy toàn thân trước khi vào trận.</w:t>
       </w:r>
     </w:p>
     <w:p>
@@ -1516,7 +1516,7 @@
                 <w:sz w:val="20"/>
                 <w:szCs w:val="20"/>
               </w:rPr>
-              <w:t xml:space="preserve">docs/De_cuong_du_an_FitDuel.docx — mục tiêu, phạm vi, yêu cầu chức năng/phi chức năng, kiến trúc, phân công, kế hoạch 12 tuần, rủi ro</w:t>
+              <w:t xml:space="preserve">docs/De_cuong_du_an_FitDuel.docx: mục tiêu, phạm vi, yêu cầu chức năng/phi chức năng, kiến trúc, phân công, kế hoạch 12 tuần, rủi ro</w:t>
             </w:r>
           </w:p>
         </w:tc>
@@ -1608,7 +1608,7 @@
                 <w:sz w:val="20"/>
                 <w:szCs w:val="20"/>
               </w:rPr>
-              <w:t xml:space="preserve">Tài liệu này — docs/PA02_SDP_FitDuel.docx</w:t>
+              <w:t xml:space="preserve">Tài liệu này (docs/PA02_SDP_FitDuel.docx)</w:t>
             </w:r>
           </w:p>
         </w:tc>
@@ -1792,7 +1792,7 @@
                 <w:sz w:val="20"/>
                 <w:szCs w:val="20"/>
               </w:rPr>
-              <w:t xml:space="preserve">docs/Gantt_FitDuel_chi_tiet.xlsx (có biểu đồ) và bản ảnh docs/Gantt_FitDuel_chi_tiet.png — 21 công việc, 12 tuần, 5 người</w:t>
+              <w:t xml:space="preserve">docs/Gantt_FitDuel_chi_tiet.xlsx (có biểu đồ) và bản ảnh docs/Gantt_FitDuel_chi_tiet.png, gồm 21 công việc, 12 tuần, 5 người</w:t>
             </w:r>
           </w:p>
         </w:tc>
@@ -1976,7 +1976,7 @@
                 <w:sz w:val="20"/>
                 <w:szCs w:val="20"/>
               </w:rPr>
-              <w:t xml:space="preserve">CONTRIBUTING.md — quy ước nhánh, commit, cấu trúc thư mục, quy trình Pull Request</w:t>
+              <w:t xml:space="preserve">CONTRIBUTING.md: quy ước nhánh, commit, cấu trúc thư mục, quy trình Pull Request</w:t>
             </w:r>
           </w:p>
         </w:tc>
@@ -2317,7 +2317,7 @@
         <w:spacing w:after="120" w:line="276"/>
       </w:pPr>
       <w:r>
-        <w:t xml:space="preserve">Cấu trúc nhóm là cấu trúc phẳng, chia theo thành phần kỹ thuật của hệ thống. Năm phần việc — pose estimation, mini-game, backend và đồng bộ, giao diện, kiểm thử và tài liệu — tương ứng với năm vai trò, mỗi vai trò do một thành viên phụ trách. Cách chia này được chọn để ba mảng kỹ thuật lõi (pose estimation, mini-game, backend ghép trận) có thể triển khai song song ngay từ tuần 2, mỗi người dùng dữ liệu giả lập cho phần của mình mà không phải chờ người khác xong trước.</w:t>
+        <w:t xml:space="preserve">Cấu trúc nhóm là cấu trúc phẳng, chia theo thành phần kỹ thuật của hệ thống. Năm phần việc (pose estimation, mini-game, backend và đồng bộ, giao diện, kiểm thử và tài liệu) tương ứng với năm vai trò, mỗi vai trò do một thành viên phụ trách. Cách chia này được chọn để ba mảng kỹ thuật lõi (pose estimation, mini-game, backend ghép trận) có thể triển khai song song ngay từ tuần 2, mỗi người dùng dữ liệu giả lập cho phần của mình mà không phải chờ người khác xong trước.</w:t>
       </w:r>
     </w:p>
     <w:p>
@@ -2702,7 +2702,7 @@
                 <w:sz w:val="20"/>
                 <w:szCs w:val="20"/>
               </w:rPr>
-              <w:t xml:space="preserve">Pose Estimation — tích hợp thư viện pose estimation, tính độ sâu chuyển động, hiệu chỉnh ngưỡng cho từng bài tập</w:t>
+              <w:t xml:space="preserve">Pose Estimation: tích hợp thư viện pose estimation, tính độ sâu chuyển động, hiệu chỉnh ngưỡng cho từng bài tập</w:t>
             </w:r>
           </w:p>
         </w:tc>
@@ -2854,7 +2854,7 @@
                 <w:sz w:val="20"/>
                 <w:szCs w:val="20"/>
               </w:rPr>
-              <w:t xml:space="preserve">Mini-game — dựng engine game, ánh xạ tín hiệu chuyển động vào điều khiển nhân vật</w:t>
+              <w:t xml:space="preserve">Mini-game: dựng engine game, ánh xạ tín hiệu chuyển động vào điều khiển nhân vật</w:t>
             </w:r>
           </w:p>
         </w:tc>
@@ -3006,7 +3006,7 @@
                 <w:sz w:val="20"/>
                 <w:szCs w:val="20"/>
               </w:rPr>
-              <w:t xml:space="preserve">Backend &amp; đồng bộ — ghép trận, đồng bộ trạng thái qua Firebase, chấm điểm, lịch sử trận đấu</w:t>
+              <w:t xml:space="preserve">Backend &amp; đồng bộ: ghép trận, đồng bộ trạng thái qua Firebase, chấm điểm, lịch sử trận đấu</w:t>
             </w:r>
           </w:p>
         </w:tc>
@@ -3158,7 +3158,7 @@
                 <w:sz w:val="20"/>
                 <w:szCs w:val="20"/>
               </w:rPr>
-              <w:t xml:space="preserve">Giao diện — màn hình chia đôi, tài khoản, lịch sử; và tính năng nâng cao (WebRTC, xử lý mất kết nối) nếu kịp thời gian</w:t>
+              <w:t xml:space="preserve">Giao diện: màn hình chia đôi, tài khoản, lịch sử; và tính năng nâng cao (WebRTC, xử lý mất kết nối) nếu kịp thời gian</w:t>
             </w:r>
           </w:p>
         </w:tc>
@@ -3310,7 +3310,7 @@
                 <w:sz w:val="20"/>
                 <w:szCs w:val="20"/>
               </w:rPr>
-              <w:t xml:space="preserve">Kiểm thử &amp; tài liệu — kiểm thử toàn hệ thống (nhiều điều kiện mạng và ánh sáng), viết SRS/tài liệu, chuẩn bị kịch bản và thiết bị demo</w:t>
+              <w:t xml:space="preserve">Kiểm thử &amp; tài liệu: kiểm thử toàn hệ thống (nhiều điều kiện mạng và ánh sáng), viết SRS/tài liệu, chuẩn bị kịch bản và thiết bị demo</w:t>
             </w:r>
           </w:p>
         </w:tc>
@@ -4761,7 +4761,7 @@
                 <w:sz w:val="20"/>
                 <w:szCs w:val="20"/>
               </w:rPr>
-              <w:t xml:space="preserve">0 — dự án học thuật, không có ngân sách</w:t>
+              <w:t xml:space="preserve">0 (dự án học thuật, không có ngân sách)</w:t>
             </w:r>
           </w:p>
         </w:tc>
@@ -4780,7 +4780,7 @@
         <w:spacing w:after="120" w:line="276"/>
       </w:pPr>
       <w:r>
-        <w:t xml:space="preserve">Ước lượng này sẽ được xem lại ở cuối mỗi giai đoạn: nếu một công việc vượt quá số tuần đã dự kiến, nhóm điều chỉnh bằng cách cắt bớt phần nâng cao (xem mục 4.2.2) thay vì giãn hạn nộp — vì hạn nộp là ràng buộc cứng.</w:t>
+        <w:t xml:space="preserve">Ước lượng này sẽ được xem lại ở cuối mỗi giai đoạn: nếu một công việc vượt quá số tuần đã dự kiến, nhóm điều chỉnh bằng cách cắt bớt phần nâng cao (xem mục 4.2.2) thay vì giãn hạn nộp, vì hạn nộp là ràng buộc cứng.</w:t>
       </w:r>
     </w:p>
     <w:p>
@@ -4832,7 +4832,7 @@
         <w:t xml:space="preserve">Inception (tuần 1–2)</w:t>
       </w:r>
       <w:r>
-        <w:t xml:space="preserve"> — khớp với khối công việc “viết SRS, phân tích yêu cầu, use case, chọn công nghệ, chia việc” trong đề cương, cùng các công việc thiết kế ở đầu Gantt (thiết kế cơ chế game, thiết kế schema và luồng ghép trận, thiết kế UI/UX, tích hợp thư viện pose estimation). Đây đúng là mục đích của pha Inception: chốt phạm vi, chốt công nghệ và chứng minh ý tưởng là khả thi.</w:t>
+        <w:t xml:space="preserve">: khớp với khối công việc “viết SRS, phân tích yêu cầu, use case, chọn công nghệ, chia việc” trong đề cương, cùng các công việc thiết kế ở đầu Gantt (thiết kế cơ chế game, thiết kế schema và luồng ghép trận, thiết kế UI/UX, tích hợp thư viện pose estimation). Đây đúng là mục đích của pha Inception: chốt phạm vi, chốt công nghệ và chứng minh ý tưởng là khả thi.</w:t>
       </w:r>
     </w:p>
     <w:p>
@@ -4852,7 +4852,7 @@
         <w:t xml:space="preserve">Elaboration (tuần 3–7)</w:t>
       </w:r>
       <w:r>
-        <w:t xml:space="preserve"> — khớp với hai khối “tuần 2–4” và “tuần 5–7” trong đề cương, tức giai đoạn ba mảng kỹ thuật lõi được xây dựng song song rồi nối lại với nhau. Đây là pha Elaboration vì mục tiêu chính của nó là khử rủi ro kiến trúc: chứng minh pipeline camera → pose estimation → mini-game → đồng bộ Firebase chạy được xuyên suốt, chứ không phải hoàn thiện tính năng.</w:t>
+        <w:t xml:space="preserve">: khớp với hai khối “tuần 2–4” và “tuần 5–7” trong đề cương, tức giai đoạn ba mảng kỹ thuật lõi được xây dựng song song rồi nối lại với nhau. Đây là pha Elaboration vì mục tiêu chính của nó là khử rủi ro kiến trúc: chứng minh pipeline camera → pose estimation → mini-game → đồng bộ Firebase chạy được xuyên suốt, chứ không phải hoàn thiện tính năng.</w:t>
       </w:r>
     </w:p>
     <w:p>
@@ -4872,7 +4872,7 @@
         <w:t xml:space="preserve">Construction (tuần 8–9)</w:t>
       </w:r>
       <w:r>
-        <w:t xml:space="preserve"> — khớp với khối “tuần 8–9” trong đề cương (thêm tính năng nâng cao nếu còn thời gian, kiểm thử toàn hệ thống, sửa lỗi) và các công việc nâng cao trong Gantt (mini-game cho squat, signaling WebRTC, tích hợp WebRTC video). Pha này bổ sung phần còn lại của tính năng lên trên kiến trúc đã được chứng minh ở Elaboration.</w:t>
+        <w:t xml:space="preserve">: khớp với khối “tuần 8–9” trong đề cương (thêm tính năng nâng cao nếu còn thời gian, kiểm thử toàn hệ thống, sửa lỗi) và các công việc nâng cao trong Gantt (mini-game cho squat, signaling WebRTC, tích hợp WebRTC video). Pha này bổ sung phần còn lại của tính năng lên trên kiến trúc đã được chứng minh ở Elaboration.</w:t>
       </w:r>
     </w:p>
     <w:p>
@@ -4892,7 +4892,7 @@
         <w:t xml:space="preserve">Transition (tuần 10–12)</w:t>
       </w:r>
       <w:r>
-        <w:t xml:space="preserve"> — khớp với khối “tuần 10–11” và “tuần 12” trong đề cương, tức toàn bộ các công việc “hỗ trợ kiểm thử &amp; sửa lỗi”, “tối ưu hiệu năng/độ trễ”, “viết báo cáo hoàn chỉnh” và “diễn tập &amp; chuẩn bị demo”. Pha này không thêm tính năng mới, chỉ ổn định sản phẩm và chuyển giao: nộp báo cáo và demo trước giảng viên.</w:t>
+        <w:t xml:space="preserve">: khớp với khối “tuần 10–11” và “tuần 12” trong đề cương, tức toàn bộ các công việc “hỗ trợ kiểm thử &amp; sửa lỗi”, “tối ưu hiệu năng/độ trễ”, “viết báo cáo hoàn chỉnh” và “diễn tập &amp; chuẩn bị demo”. Pha này không thêm tính năng mới, chỉ ổn định sản phẩm và chuyển giao: nộp báo cáo và demo trước giảng viên.</w:t>
       </w:r>
     </w:p>
     <w:p>
@@ -5706,7 +5706,7 @@
         <w:spacing w:after="60" w:line="276"/>
       </w:pPr>
       <w:r>
-        <w:t xml:space="preserve">Mục tiêu: chứng minh ba mảng kỹ thuật lõi — pose estimation, mini-game, backend ghép trận — hoạt động được một cách độc lập, sau đó nối chúng lại thành một luồng xuyên suốt.</w:t>
+        <w:t xml:space="preserve">Mục tiêu: chứng minh ba mảng kỹ thuật lõi (pose estimation, mini-game, backend ghép trận) hoạt động được một cách độc lập, sau đó nối chúng lại thành một luồng xuyên suốt.</w:t>
       </w:r>
     </w:p>
     <w:p>
@@ -6125,7 +6125,7 @@
                 <w:sz w:val="20"/>
                 <w:szCs w:val="20"/>
               </w:rPr>
-              <w:t xml:space="preserve">Chứng minh phần rủi ro kỹ thuật cao nhất là làm được (đã đạt — xem mục 4.2.1)</w:t>
+              <w:t xml:space="preserve">Chứng minh phần rủi ro kỹ thuật cao nhất là làm được (đã đạt, xem mục 4.2.1)</w:t>
             </w:r>
           </w:p>
         </w:tc>
@@ -11045,7 +11045,7 @@
                 <w:sz w:val="20"/>
                 <w:szCs w:val="20"/>
               </w:rPr>
-              <w:t xml:space="preserve">Màn hình chia đôi chạy bằng dữ liệu thật; kịch bản test case hoàn tất — kết thúc pha Elaboration</w:t>
+              <w:t xml:space="preserve">Màn hình chia đôi chạy bằng dữ liệu thật; kịch bản test case hoàn tất, kết thúc pha Elaboration</w:t>
             </w:r>
           </w:p>
         </w:tc>
@@ -11137,7 +11137,7 @@
                 <w:sz w:val="20"/>
                 <w:szCs w:val="20"/>
               </w:rPr>
-              <w:t xml:space="preserve">Phần nâng cao (squat, WebRTC) chốt tới mức đạt được — đóng băng tính năng</w:t>
+              <w:t xml:space="preserve">Phần nâng cao (squat, WebRTC) chốt tới mức đạt được, đóng băng tính năng</w:t>
             </w:r>
           </w:p>
         </w:tc>
@@ -11677,7 +11677,7 @@
         <w:spacing w:after="60" w:line="276"/>
       </w:pPr>
       <w:r>
-        <w:t xml:space="preserve">Yêu cầu ở mức cao (bài toán, người dùng mục tiêu, danh sách tính năng chính) được ghi trong Vision Document — tài liệu song hành với tài liệu SDP này.</w:t>
+        <w:t xml:space="preserve">Yêu cầu ở mức cao (bài toán, người dùng mục tiêu, danh sách tính năng chính) được ghi trong Vision Document, tài liệu song hành với tài liệu SDP này.</w:t>
       </w:r>
     </w:p>
     <w:p>
@@ -11703,7 +11703,7 @@
         <w:spacing w:after="60" w:line="276"/>
       </w:pPr>
       <w:r>
-        <w:t xml:space="preserve">Yêu cầu kỹ thuật đã được cụ thể hoá thành đặc tả nằm trong docs/pose_estimation_spec.md, docs/game_mechanics_spec.md và docs/firebase_schema.md. Các tệp README.md trong app/lib/ ghi rõ phần nào đã hiện thực, phần nào cố ý chưa làm — để người đọc sau không nhầm phần chưa làm là lỗi hoặc là bị quên.</w:t>
+        <w:t xml:space="preserve">Yêu cầu kỹ thuật đã được cụ thể hoá thành đặc tả nằm trong docs/pose_estimation_spec.md, docs/game_mechanics_spec.md và docs/firebase_schema.md. Các tệp README.md trong app/lib/ ghi rõ phần nào đã hiện thực, phần nào cố ý chưa làm, để người đọc sau không nhầm phần chưa làm là lỗi hoặc là bị quên.</w:t>
       </w:r>
     </w:p>
     <w:p>
@@ -11847,7 +11847,7 @@
         <w:spacing w:after="120" w:line="276"/>
       </w:pPr>
       <w:r>
-        <w:t xml:space="preserve">Nhóm không dùng công cụ quản lý dự án riêng. Toàn bộ việc báo cáo và đo lường tiến độ dựa trên GitHub — đây là cách nhóm đang thực sự làm, không phải quy trình đặt ra trên giấy:</w:t>
+        <w:t xml:space="preserve">Nhóm không dùng công cụ quản lý dự án riêng. Toàn bộ việc báo cáo và đo lường tiến độ dựa trên GitHub, đúng theo cách nhóm đang thực sự làm việc:</w:t>
       </w:r>
     </w:p>
     <w:p>
@@ -11873,7 +11873,7 @@
         <w:spacing w:after="60" w:line="276"/>
       </w:pPr>
       <w:r>
-        <w:t xml:space="preserve">Pull Request là đơn vị báo cáo công việc. Mỗi PR mô tả phần việc đã làm theo mẫu PR có sẵn, và phải được ít nhất một thành viên khác review và approve trước khi merge — nên mỗi phần việc hoàn thành đều có ít nhất hai người biết nội dung.</w:t>
+        <w:t xml:space="preserve">Pull Request là đơn vị báo cáo công việc. Mỗi PR mô tả phần việc đã làm theo mẫu PR có sẵn, và phải được ít nhất một thành viên khác review và approve trước khi merge, nên mỗi phần việc hoàn thành đều có ít nhất hai người biết nội dung.</w:t>
       </w:r>
     </w:p>
     <w:p>
@@ -12809,7 +12809,7 @@
                 <w:sz w:val="20"/>
                 <w:szCs w:val="20"/>
               </w:rPr>
-              <w:t xml:space="preserve">Xây dựng như lớp phủ thêm trên bản MVP đã chạy tốt — nếu chưa ổn định thì demo bằng bản MVP không có video, không ảnh hưởng phần lõi</w:t>
+              <w:t xml:space="preserve">Xây dựng như lớp phủ thêm trên bản MVP đã chạy tốt. Nếu chưa ổn định thì demo bằng bản MVP không có video, không ảnh hưởng phần lõi</w:t>
             </w:r>
           </w:p>
         </w:tc>

</xml_diff>